<commit_message>
Đổi nhãn bước B0 thành "VHV tạo đề xuất"; cập nhật mẫu BBNT DO lõi lọc
- MaterialTicketBoard: nhãn bước B0 của cả 4 luồng đổi "VHV tạo phiếu" →
  "VHV tạo đề xuất", khớp với nút "Tạo đề xuất" vừa đổi ở fcc03ab.
- templates/bbnt-do-template-loi.docx: bản Word do người dùng chỉnh (16.731 →
  19.489 bytes). Mẫu này được lib/bbnt-do-doc.ts nạp thẳng từ thư mục templates
  của repo cho loại vật tư "Lọc dầu / Lõi lọc dầu", nên phải đi kèm deploy.
  Đã đối chiếu trước khi commit: zip hợp lệ, còn nguyên 28 placeholder, không
  mất cũng không thêm token nào so với bản đang chạy.

Co-Authored-By: Claude Opus 5 <noreply@anthropic.com>
</commit_message>
<xml_diff>
--- a/templates/bbnt-do-template-loi.docx
+++ b/templates/bbnt-do-template-loi.docx
@@ -94,12 +94,11 @@
           <w:p>
             <w:pPr>
               <w:spacing w:after="0" w:line="276" w:lineRule="auto"/>
-            </w:pPr>
-            <w:r>
-              <w:rPr>
-                <w:rFonts w:ascii="Times New Roman" w:hAnsi="Times New Roman" w:cs="Times New Roman"/>
-                <w:sz w:val="26"/>
-                <w:szCs w:val="26"/>
+              <w:jc w:val="center"/>
+            </w:pPr>
+            <w:r>
+              <w:rPr>
+                <w:rFonts w:ascii="Times New Roman" w:hAnsi="Times New Roman" w:cs="Times New Roman"/>
               </w:rPr>
               <w:t>Số: ……………</w:t>
             </w:r>
@@ -119,8 +118,6 @@
               <w:rPr>
                 <w:rFonts w:ascii="Times New Roman" w:hAnsi="Times New Roman" w:cs="Times New Roman"/>
                 <w:i/>
-                <w:sz w:val="26"/>
-                <w:szCs w:val="26"/>
               </w:rPr>
               <w:t>Vĩnh Long, ngày …… tháng …… năm ……</w:t>
             </w:r>
@@ -261,7 +258,25 @@
           <w:sz w:val="26"/>
           <w:szCs w:val="26"/>
         </w:rPr>
-        <w:t>PCT/LCT số: {{pctNumber}}</w:t>
+        <w:t xml:space="preserve">PCT/LCT </w:t>
+      </w:r>
+      <w:proofErr w:type="gramStart"/>
+      <w:r>
+        <w:rPr>
+          <w:rFonts w:ascii="Times New Roman" w:hAnsi="Times New Roman" w:cs="Times New Roman"/>
+          <w:sz w:val="26"/>
+          <w:szCs w:val="26"/>
+        </w:rPr>
+        <w:t>số:{</w:t>
+      </w:r>
+      <w:proofErr w:type="gramEnd"/>
+      <w:r>
+        <w:rPr>
+          <w:rFonts w:ascii="Times New Roman" w:hAnsi="Times New Roman" w:cs="Times New Roman"/>
+          <w:sz w:val="26"/>
+          <w:szCs w:val="26"/>
+        </w:rPr>
+        <w:t>{pctNumber}}</w:t>
       </w:r>
     </w:p>
     <w:p>
@@ -969,6 +984,7 @@
           <w:sz w:val="26"/>
           <w:szCs w:val="26"/>
         </w:rPr>
+        <w:lastRenderedPageBreak/>
         <w:t>-</w:t>
       </w:r>
       <w:r>
@@ -1005,7 +1021,6 @@
           <w:sz w:val="26"/>
           <w:szCs w:val="26"/>
         </w:rPr>
-        <w:lastRenderedPageBreak/>
         <w:t>-</w:t>
       </w:r>
       <w:r>
@@ -1086,8 +1101,6 @@
               <w:rPr>
                 <w:rFonts w:ascii="Times New Roman" w:hAnsi="Times New Roman" w:cs="Times New Roman"/>
                 <w:b/>
-                <w:sz w:val="26"/>
-                <w:szCs w:val="26"/>
               </w:rPr>
               <w:t>Stt</w:t>
             </w:r>
@@ -1107,8 +1120,6 @@
               <w:rPr>
                 <w:rFonts w:ascii="Times New Roman" w:hAnsi="Times New Roman" w:cs="Times New Roman"/>
                 <w:b/>
-                <w:sz w:val="26"/>
-                <w:szCs w:val="26"/>
               </w:rPr>
               <w:t>Nội dung công tác</w:t>
             </w:r>
@@ -1128,8 +1139,6 @@
               <w:rPr>
                 <w:rFonts w:ascii="Times New Roman" w:hAnsi="Times New Roman" w:cs="Times New Roman"/>
                 <w:b/>
-                <w:sz w:val="26"/>
-                <w:szCs w:val="26"/>
               </w:rPr>
               <w:t>Kết quả</w:t>
             </w:r>
@@ -1149,8 +1158,6 @@
               <w:rPr>
                 <w:rFonts w:ascii="Times New Roman" w:hAnsi="Times New Roman" w:cs="Times New Roman"/>
                 <w:b/>
-                <w:sz w:val="26"/>
-                <w:szCs w:val="26"/>
               </w:rPr>
               <w:t>Vật tư thay thế</w:t>
             </w:r>
@@ -1170,8 +1177,6 @@
               <w:rPr>
                 <w:rFonts w:ascii="Times New Roman" w:hAnsi="Times New Roman" w:cs="Times New Roman"/>
                 <w:b/>
-                <w:sz w:val="26"/>
-                <w:szCs w:val="26"/>
               </w:rPr>
               <w:t>Ghi chú</w:t>
             </w:r>
@@ -1212,18 +1217,8 @@
             <w:r>
               <w:rPr>
                 <w:rFonts w:ascii="Times New Roman" w:hAnsi="Times New Roman" w:cs="Times New Roman"/>
-                <w:sz w:val="26"/>
-                <w:szCs w:val="26"/>
-              </w:rPr>
-              <w:t>-</w:t>
-            </w:r>
-            <w:r>
-              <w:rPr>
-                <w:rFonts w:ascii="Times New Roman" w:hAnsi="Times New Roman" w:cs="Times New Roman"/>
-                <w:sz w:val="26"/>
-                <w:szCs w:val="26"/>
-              </w:rPr>
-              <w:t>Cô lập thiết bị</w:t>
+              </w:rPr>
+              <w:t>-Cô lập thiết bị</w:t>
             </w:r>
           </w:p>
         </w:tc>
@@ -1240,8 +1235,6 @@
             <w:r>
               <w:rPr>
                 <w:rFonts w:ascii="Times New Roman" w:hAnsi="Times New Roman" w:cs="Times New Roman"/>
-                <w:sz w:val="26"/>
-                <w:szCs w:val="26"/>
               </w:rPr>
               <w:t>Đạt</w:t>
             </w:r>
@@ -1309,7 +1302,7 @@
               <w:rPr>
                 <w:rFonts w:ascii="Times New Roman" w:hAnsi="Times New Roman" w:cs="Times New Roman"/>
               </w:rPr>
-              <w:t xml:space="preserve">-Tháo và vệ sinh bên trong bộ lọc</w:t>
+              <w:t>-Tháo và vệ sinh bên trong bộ lọc</w:t>
             </w:r>
           </w:p>
         </w:tc>
@@ -1326,8 +1319,6 @@
             <w:r>
               <w:rPr>
                 <w:rFonts w:ascii="Times New Roman" w:hAnsi="Times New Roman" w:cs="Times New Roman"/>
-                <w:sz w:val="26"/>
-                <w:szCs w:val="26"/>
               </w:rPr>
               <w:t>Đạt</w:t>
             </w:r>
@@ -1395,7 +1386,7 @@
               <w:rPr>
                 <w:rFonts w:ascii="Times New Roman" w:hAnsi="Times New Roman" w:cs="Times New Roman"/>
               </w:rPr>
-              <w:t xml:space="preserve">-Thay mới lõi lọc</w:t>
+              <w:t>-Thay mới lõi lọc</w:t>
             </w:r>
           </w:p>
         </w:tc>
@@ -1412,8 +1403,6 @@
             <w:r>
               <w:rPr>
                 <w:rFonts w:ascii="Times New Roman" w:hAnsi="Times New Roman" w:cs="Times New Roman"/>
-                <w:sz w:val="26"/>
-                <w:szCs w:val="26"/>
               </w:rPr>
               <w:t>Đạt</w:t>
             </w:r>
@@ -1432,8 +1421,6 @@
             <w:r>
               <w:rPr>
                 <w:rFonts w:ascii="Times New Roman" w:hAnsi="Times New Roman" w:cs="Times New Roman"/>
-                <w:sz w:val="26"/>
-                <w:szCs w:val="26"/>
               </w:rPr>
               <w:t>{{materialSummary}}</w:t>
             </w:r>
@@ -1489,7 +1476,7 @@
               <w:rPr>
                 <w:rFonts w:ascii="Times New Roman" w:hAnsi="Times New Roman" w:cs="Times New Roman"/>
               </w:rPr>
-              <w:t xml:space="preserve">-Lắp đặt lại bộ lọc</w:t>
+              <w:t>-Lắp đặt lại bộ lọc</w:t>
             </w:r>
           </w:p>
         </w:tc>
@@ -1506,8 +1493,6 @@
             <w:r>
               <w:rPr>
                 <w:rFonts w:ascii="Times New Roman" w:hAnsi="Times New Roman" w:cs="Times New Roman"/>
-                <w:sz w:val="26"/>
-                <w:szCs w:val="26"/>
               </w:rPr>
               <w:t>Đạt</w:t>
             </w:r>
@@ -1571,18 +1556,8 @@
             <w:r>
               <w:rPr>
                 <w:rFonts w:ascii="Times New Roman" w:hAnsi="Times New Roman" w:cs="Times New Roman"/>
-                <w:sz w:val="26"/>
-                <w:szCs w:val="26"/>
-              </w:rPr>
-              <w:t>-</w:t>
-            </w:r>
-            <w:r>
-              <w:rPr>
-                <w:rFonts w:ascii="Times New Roman" w:hAnsi="Times New Roman" w:cs="Times New Roman"/>
-                <w:sz w:val="26"/>
-                <w:szCs w:val="26"/>
-              </w:rPr>
-              <w:t>Thu dọn dụng cụ, vật tư, vệ sinh sạch sẽ vị trí công tác.</w:t>
+              </w:rPr>
+              <w:t>-Thu dọn dụng cụ, vật tư, vệ sinh sạch sẽ vị trí công tác.</w:t>
             </w:r>
           </w:p>
         </w:tc>
@@ -1599,8 +1574,6 @@
             <w:r>
               <w:rPr>
                 <w:rFonts w:ascii="Times New Roman" w:hAnsi="Times New Roman" w:cs="Times New Roman"/>
-                <w:sz w:val="26"/>
-                <w:szCs w:val="26"/>
               </w:rPr>
               <w:t>Đạt</w:t>
             </w:r>
@@ -1664,18 +1637,8 @@
             <w:r>
               <w:rPr>
                 <w:rFonts w:ascii="Times New Roman" w:hAnsi="Times New Roman" w:cs="Times New Roman"/>
-                <w:sz w:val="26"/>
-                <w:szCs w:val="26"/>
-              </w:rPr>
-              <w:t>-</w:t>
-            </w:r>
-            <w:r>
-              <w:rPr>
-                <w:rFonts w:ascii="Times New Roman" w:hAnsi="Times New Roman" w:cs="Times New Roman"/>
-                <w:sz w:val="26"/>
-                <w:szCs w:val="26"/>
-              </w:rPr>
-              <w:t>Tái lập thiết bị, vận hành kiểm tra.</w:t>
+              </w:rPr>
+              <w:t>-Tái lập thiết bị, vận hành kiểm tra.</w:t>
             </w:r>
           </w:p>
         </w:tc>
@@ -1692,8 +1655,6 @@
             <w:r>
               <w:rPr>
                 <w:rFonts w:ascii="Times New Roman" w:hAnsi="Times New Roman" w:cs="Times New Roman"/>
-                <w:sz w:val="26"/>
-                <w:szCs w:val="26"/>
               </w:rPr>
               <w:t>Đạt</w:t>
             </w:r>
@@ -2267,22 +2228,25 @@
                 <w:szCs w:val="26"/>
               </w:rPr>
             </w:pPr>
-            <w:r>
+          </w:p>
+        </w:tc>
+        <w:tc>
+          <w:tcPr>
+            <w:tcW w:w="4850" w:type="dxa"/>
+            <w:vAlign w:val="center"/>
+          </w:tcPr>
+          <w:p>
+            <w:pPr>
+              <w:spacing w:before="240" w:after="0" w:line="276" w:lineRule="auto"/>
+              <w:jc w:val="center"/>
               <w:rPr>
                 <w:rFonts w:ascii="Times New Roman" w:hAnsi="Times New Roman" w:cs="Times New Roman"/>
                 <w:b/>
                 <w:sz w:val="26"/>
                 <w:szCs w:val="26"/>
               </w:rPr>
-              <w:t>Trống</w:t>
-            </w:r>
-          </w:p>
-        </w:tc>
-        <w:tc>
-          <w:tcPr>
-            <w:tcW w:w="4850" w:type="dxa"/>
-            <w:vAlign w:val="center"/>
-          </w:tcPr>
+            </w:pPr>
+          </w:p>
           <w:p>
             <w:pPr>
               <w:spacing w:before="240" w:after="0" w:line="276" w:lineRule="auto"/>
@@ -2294,27 +2258,6 @@
                 <w:szCs w:val="26"/>
               </w:rPr>
             </w:pPr>
-          </w:p>
-          <w:p>
-            <w:pPr>
-              <w:spacing w:before="240" w:after="0" w:line="276" w:lineRule="auto"/>
-              <w:jc w:val="center"/>
-              <w:rPr>
-                <w:rFonts w:ascii="Times New Roman" w:hAnsi="Times New Roman" w:cs="Times New Roman"/>
-                <w:b/>
-                <w:sz w:val="26"/>
-                <w:szCs w:val="26"/>
-              </w:rPr>
-            </w:pPr>
-            <w:r>
-              <w:rPr>
-                <w:rFonts w:ascii="Times New Roman" w:hAnsi="Times New Roman" w:cs="Times New Roman"/>
-                <w:b/>
-                <w:sz w:val="26"/>
-                <w:szCs w:val="26"/>
-              </w:rPr>
-              <w:t>Trống</w:t>
-            </w:r>
           </w:p>
         </w:tc>
       </w:tr>
@@ -2418,7 +2361,7 @@
           <w:sz w:val="22"/>
           <w:szCs w:val="22"/>
         </w:rPr>
-        <w:t>- Lưu: VH1, KH&amp;VT;</w:t>
+        <w:t>- Lưu: VH1, KHVT;</w:t>
       </w:r>
     </w:p>
     <w:p>
@@ -2818,7 +2761,25 @@
                 <w:sz w:val="22"/>
                 <w:szCs w:val="22"/>
               </w:rPr>
-              <w:t>{{#items}}{{stt}}</w:t>
+              <w:t>{{#items</w:t>
+            </w:r>
+            <w:proofErr w:type="gramStart"/>
+            <w:r>
+              <w:rPr>
+                <w:rFonts w:ascii="Times New Roman" w:hAnsi="Times New Roman" w:cs="Times New Roman"/>
+                <w:sz w:val="22"/>
+                <w:szCs w:val="22"/>
+              </w:rPr>
+              <w:t>}}{</w:t>
+            </w:r>
+            <w:proofErr w:type="gramEnd"/>
+            <w:r>
+              <w:rPr>
+                <w:rFonts w:ascii="Times New Roman" w:hAnsi="Times New Roman" w:cs="Times New Roman"/>
+                <w:sz w:val="22"/>
+                <w:szCs w:val="22"/>
+              </w:rPr>
+              <w:t>{stt}}</w:t>
             </w:r>
           </w:p>
         </w:tc>
@@ -3736,6 +3697,7 @@
   <w:style w:type="character" w:default="1" w:styleId="DefaultParagraphFont">
     <w:name w:val="Default Paragraph Font"/>
     <w:uiPriority w:val="1"/>
+    <w:semiHidden/>
     <w:unhideWhenUsed/>
   </w:style>
   <w:style w:type="table" w:default="1" w:styleId="TableNormal">

</xml_diff>